<commit_message>
Update report affiliation and guide placeholders
</commit_message>
<xml_diff>
--- a/Mini_Project_Report_Abhinav_Mohapatra.docx
+++ b/Mini_Project_Report_Abhinav_Mohapatra.docx
@@ -38,7 +38,7 @@
         <w:jc w:val="center"/>
       </w:pPr>
       <w:r>
-        <w:t>Affiliation: Department of Computer Science and Engineering</w:t>
+        <w:t>Affiliation: Department of Computer Science and Engineering, Manipal Institute of Technology, Manipal, Karnataka - 576104</w:t>
       </w:r>
     </w:p>
     <w:p>
@@ -46,7 +46,7 @@
         <w:jc w:val="center"/>
       </w:pPr>
       <w:r>
-        <w:t>Project Guide: To be updated as per institute record</w:t>
+        <w:t>Project Guide: &lt;&lt;Name of the Internal Guide&gt;&gt;, &lt;&lt;Designation of the internal guide&gt;&gt;</w:t>
       </w:r>
     </w:p>
     <w:p>

</xml_diff>